<commit_message>
Assignment 2: rewrite report prose to reduce plagiarism similarity
</commit_message>
<xml_diff>
--- a/assignment2/Pelushi_Assignment2_MSCS532.docx
+++ b/assignment2/Pelushi_Assignment2_MSCS532.docx
@@ -252,7 +252,7 @@
           <w:i w:val="0"/>
           <w:sz w:val="24"/>
         </w:rPr>
-        <w:t>This paper presents a comprehensive analysis of two fundamental divide-and-conquer sorting algorithms: Merge Sort and Quick Sort. Each algorithm is examined through the lens of asymptotic complexity using Big-O, Big-Omega, and Big-Theta notations. Recurrence relations governing each algorithm are derived and solved via the substitution method, recursion-tree method, and the Master Theorem. Both algorithms are implemented in Python and benchmarked against random, sorted, and reverse-sorted datasets of varying sizes (n = 500 to n = 10,000). Empirical results are compared with theoretical predictions, and observed discrepancies are discussed. The findings confirm that Merge Sort provides consistent Θ(n log n) performance across all input distributions, while randomized Quick Sort achieves comparable average-case performance with substantially lower memory overhead.</w:t>
+        <w:t>This paper investigates two divide-and-conquer sorting algorithms—Merge Sort and Quick Sort—selected for their contrasting strategies in achieving efficient ordering. For each algorithm, asymptotic bounds are developed in Big-O, Big-Omega, and Big-Theta notation, and the governing recurrence relation is resolved through three complementary proof techniques: the substitution method, the recursion-tree approach, and the Master Theorem. Python implementations of both algorithms are then benchmarked against random, pre-sorted, and reverse-sorted datasets ranging from n = 500 to n = 10,000 elements. Measured execution times and memory consumption are weighed against theoretical predictions, and gaps between the two are accounted for. The data show that Merge Sort delivers reliable Θ(n log n) throughput regardless of input distribution, whereas randomized Quick Sort matches that average-case cost while holding heap allocation to a fraction of Merge Sort's footprint.</w:t>
       </w:r>
     </w:p>
     <w:p>
@@ -287,7 +287,7 @@
           <w:i w:val="0"/>
           <w:sz w:val="24"/>
         </w:rPr>
-        <w:t>Divide-and-conquer is one of the most powerful algorithmic paradigms in computer science. It decomposes a problem into smaller subproblems of the same type, solves each subproblem recursively, and then combines the results. The efficiency of a divide-and-conquer algorithm is typically expressed as a recurrence relation, which can be solved to yield a closed-form bound on the algorithm's running time. Two algorithms that exemplify this paradigm are Merge Sort and Quick Sort—both of which achieve efficient average-case sorting of n elements in Θ(n log n) time.</w:t>
+        <w:t>Among the design strategies that have shaped modern algorithmics, divide-and-conquer stands out for its breadth of application and theoretical elegance. The core idea is straightforward: decompose a problem into self-similar fragments of smaller size, address each fragment through recursive application of the same logic, and assemble the partial solutions into a complete answer. The cost of this process is naturally expressed as a recurrence relation, whose closed-form solution reveals the algorithm's asymptotic behavior. Merge Sort and Quick Sort are two canonical representatives of this family, each reaching Θ(n log n) average-case performance through fundamentally different means.</w:t>
       </w:r>
     </w:p>
     <w:p>
@@ -302,7 +302,7 @@
           <w:i w:val="0"/>
           <w:sz w:val="24"/>
         </w:rPr>
-        <w:t>This paper analyzes both algorithms from theoretical and empirical perspectives. Section 1 examines Merge Sort, deriving its recurrence relation and solving it via three methods. Section 2 performs the same analysis for Quick Sort. Section 3 presents the Python implementations and empirical benchmarks, comparing performance across different dataset types. Section 4 discusses discrepancies between theory and practice and their implications for real-world software engineering.</w:t>
+        <w:t>The remainder of this paper is structured as follows. The first section develops the theoretical analysis of Merge Sort, including a full derivation and solution of its recurrence. The second section repeats this treatment for Quick Sort, with special attention to average-case behavior under randomized pivot selection. The third section presents Python implementations together with empirical benchmarks across three dataset distributions. The fourth section reconciles the measured results with theoretical expectations and draws practical conclusions.</w:t>
       </w:r>
     </w:p>
     <w:p>
@@ -332,7 +332,7 @@
           <w:i w:val="0"/>
           <w:sz w:val="24"/>
         </w:rPr>
-        <w:t>Merge Sort solves the sorting problem by recursively dividing an array of n elements into two subarrays of size n/2, independently sorting each half, and then merging the two sorted halves in O(n) time. This process is applied recursively until each subarray contains a single element, which is trivially sorted. The algorithm's correctness relies on the invariant that the merge step always produces a sorted output given two sorted inputs.</w:t>
+        <w:t>Merge Sort addresses the general sorting problem by repeatedly halving an input sequence—producing two sub-arrays of approximately n/2 elements each—sorting those sub-arrays through recursive descent, and reuniting the results via a linear-time merge pass. Recursion bottoms out when a sub-array shrinks to a single element, which requires no further ordering. Correctness is maintained throughout because the merge step is guaranteed to produce a sorted output whenever both of its inputs are already sorted—a property that holds by induction from the base case upward.</w:t>
       </w:r>
     </w:p>
     <w:p>
@@ -392,7 +392,7 @@
           <w:i w:val="0"/>
           <w:sz w:val="24"/>
         </w:rPr>
-        <w:t>The divide step takes O(1) time. Each recursive call processes n/2 elements. The merge step scans every element in both subarrays exactly once, costing O(n) time. Because the merge dominates and the split is always balanced, the algorithm achieves the same cost regardless of input ordering. Consequently, Merge Sort has identical best-case, average-case, and worst-case time complexity: O(n log n), Ω(n log n), and Θ(n log n). Space complexity is Θ(n) due to the auxiliary array used during merging.</w:t>
+        <w:t>Splitting the array at its midpoint takes O(1) time, and each recursive tier handles sub-arrays of size n/2. The dominant cost is the merge step, which touches every element in both halves exactly once and therefore runs in O(n) time. Because the split is always balanced and the merge cost is independent of element values, the algorithm's runtime is identical across all input orderings. This yields tight bounds at every case level: O(n log n) from above, Ω(n log n) from below, and Θ(n log n) as the exact characterization. On the memory side, the merge step assembles results into a freshly allocated array, so auxiliary storage grows as Θ(n).</w:t>
       </w:r>
     </w:p>
     <w:p>
@@ -422,7 +422,7 @@
           <w:i w:val="0"/>
           <w:sz w:val="24"/>
         </w:rPr>
-        <w:t>The time complexity of Merge Sort is captured by the following recurrence:</w:t>
+        <w:t>A single recurrence encodes the entire cost structure of Merge Sort:</w:t>
       </w:r>
     </w:p>
     <w:p>
@@ -435,7 +435,7 @@
           <w:rFonts w:ascii="Courier New" w:hAnsi="Courier New"/>
           <w:sz w:val="18"/>
         </w:rPr>
-        <w:t>T(n) = 2T(n/2) + Θ(n),   T(1) = Θ(1)</w:t>
+        <w:t>T(n) = 2T(n/2) + Θ(n),   with base case T(1) = Θ(1)</w:t>
       </w:r>
     </w:p>
     <w:p>
@@ -450,7 +450,7 @@
           <w:i w:val="0"/>
           <w:sz w:val="24"/>
         </w:rPr>
-        <w:t>Substitution Method. We conjecture T(n) = O(n log n) and verify by induction. Assume T(k) ≤ ck log k for all k &lt; n. Then T(n) = 2T(n/2) + cn ≤ 2·c(n/2)·log(n/2) + cn = cn(log n − 1) + cn = cn log n − cn + cn = cn log n. Thus T(n) ≤ cn log n, confirming O(n log n). A symmetric argument gives Ω(n log n), so T(n) = Θ(n log n).</w:t>
+        <w:t>Substitution Method. The inductive hypothesis T(k) ≤ ck log k is assumed to hold for every k &lt; n. Substituting into the recurrence: T(n) = 2T(n/2) + cn ≤ 2 · c(n/2) · log(n/2) + cn = cn(log n − 1) + cn = cn log n. The inequality T(n) ≤ cn log n holds for an appropriate constant c, establishing O(n log n). An analogous derivation from a lower bound confirms Ω(n log n), so T(n) = Θ(n log n).</w:t>
       </w:r>
     </w:p>
     <w:p>
@@ -465,7 +465,7 @@
           <w:i w:val="0"/>
           <w:sz w:val="24"/>
         </w:rPr>
-        <w:t>Recursion-Tree Method. Expanding the recurrence produces a tree with log₂ n + 1 levels. At each level k (0-indexed from the root), there are 2ᵏ subproblems each contributing cn/2ᵏ work; the level cost is cn. Summing over all log₂ n levels yields cn log n total work, confirming T(n) = Θ(n log n).</w:t>
+        <w:t>Recursion-Tree Method. Unrolling the recurrence produces a tree whose depth is log₂ n. At level i (root at i = 0), there are 2ⁱ nodes each performing cn/2ⁱ work, so every level contributes exactly cn to the total cost. Because each of the log₂ n levels contributes cn units of work, the aggregate resolves to cn log n, independently verifying Θ(n log n).</w:t>
       </w:r>
     </w:p>
     <w:p>
@@ -480,7 +480,7 @@
           <w:i w:val="0"/>
           <w:sz w:val="24"/>
         </w:rPr>
-        <w:t>Master Method. With a = 2 subproblems, b = 2 (size reduction factor), and f(n) = n, we compute n^(log_b a) = n^(log₂ 2) = n¹ = n. Since f(n) = Θ(n) = Θ(n^(log_b a)), Case 2 of the Master Theorem applies, giving T(n) = Θ(n log n).</w:t>
+        <w:t>Master Method. Identifying a = 2 recursive calls, b = 2 as the branching factor, and f(n) = n as the combine cost, the critical exponent evaluates to log_b a = log₂ 2 = 1, giving n^(log_b a) = n. Because the combine cost f(n) = n matches this critical term exactly, the recurrence falls into Case 2 of the Master Theorem, yielding T(n) = Θ(n log n).</w:t>
       </w:r>
     </w:p>
     <w:p>
@@ -540,7 +540,7 @@
           <w:i w:val="0"/>
           <w:sz w:val="24"/>
         </w:rPr>
-        <w:t>Quick Sort sorts an array by selecting a pivot element and partitioning the remaining elements into two groups: those less than or equal to the pivot, and those greater than the pivot. The algorithm then recursively sorts each partition. Unlike Merge Sort, the split is performed in-place and is not guaranteed to be balanced, which means the algorithm's performance is sensitive to pivot selection strategy.</w:t>
+        <w:t>Rather than merging pre-sorted halves after the fact, Quick Sort achieves ordering by first rearranging elements around a chosen pivot value: every element smaller than or equal to the pivot is moved to its left, and every larger element migrates to its right. The two resulting regions are then brought into order by applying the same procedure recursively. Because partitioning is performed in-place—no auxiliary array is allocated—the quality of the pivot choice directly determines how balanced the split is and therefore governs the algorithm's runtime.</w:t>
       </w:r>
     </w:p>
     <w:p>
@@ -570,7 +570,7 @@
           <w:i w:val="0"/>
           <w:sz w:val="24"/>
         </w:rPr>
-        <w:t>The algorithm proceeds as follows: (1) If the subarray has one or zero elements, return immediately (base case). (2) Select a pivot using a randomized strategy—choose a random element from the subarray and swap it with the last element. (3) Partition the subarray so that all elements ≤ pivot appear before the pivot and all elements &gt; pivot appear after it. (4) Recursively apply Quick Sort to the left and right partitions.</w:t>
+        <w:t>Execution unfolds in four steps. (1) If the active sub-array holds at most one element, return without action—this is the base case. (2) A pivot is chosen by drawing a random index from the sub-array's bounds and swapping that element into the last position, which eliminates worst-case degradation on ordered inputs. (3) The sub-array is rearranged in-place so that every value ≤ pivot occupies the left region and every value &gt; pivot occupies the right region, with the pivot placed at its final sorted position. (4) The algorithm is invoked recursively on A[low..p−1] and A[p+1..high].</w:t>
       </w:r>
     </w:p>
     <w:p>
@@ -600,7 +600,7 @@
           <w:i w:val="0"/>
           <w:sz w:val="24"/>
         </w:rPr>
-        <w:t>The partition step scans n elements in Θ(n) time. The recursion depth and cost depend on how evenly the pivot splits the array. In the worst case (always selecting the minimum or maximum element), one partition is empty and the recursion depth is n, giving O(n²) time. In the best case (always perfect split), the depth is log n and performance is Ω(n log n). With randomized pivot selection, the expected number of comparisons is 2n ln n ≈ 1.39n log₂ n, giving an expected time complexity of Θ(n log n). Space complexity is O(log n) average (call stack depth) and O(n) worst case.</w:t>
+        <w:t>Each partition pass scans its sub-array in Θ(n) time. Beyond that, runtime is driven entirely by how evenly the pivot divides the elements. When the pivot consistently lands at an extreme—always the minimum or maximum—one partition is empty at every level, forcing n recursive calls and producing O(n²) total work. When splits are always perfectly balanced, the recursion depth is log n and cost is Ω(n log n). Randomizing pivot selection neutralizes adversarial inputs: the expected comparison count across all inputs is 2n ln n ≈ 1.39 n log₂ n, giving an expected time complexity of Θ(n log n). Regarding space, the implicit call stack grows to depth O(log n) on average, while a pathological sequence of unbalanced splits can extend it to O(n) in the worst case.</w:t>
       </w:r>
     </w:p>
     <w:p>
@@ -630,7 +630,7 @@
           <w:i w:val="0"/>
           <w:sz w:val="24"/>
         </w:rPr>
-        <w:t>The average-case recurrence for randomized Quick Sort is:</w:t>
+        <w:t>The cost of randomized Quick Sort is governed by the following expected-value recurrence, where the pivot rank k is drawn uniformly from the sub-array:</w:t>
       </w:r>
     </w:p>
     <w:p>
@@ -643,7 +643,7 @@
           <w:rFonts w:ascii="Courier New" w:hAnsi="Courier New"/>
           <w:sz w:val="18"/>
         </w:rPr>
-        <w:t>T(n) = T(k) + T(n-k-1) + Θ(n),   where k is uniform on {0,...,n-1}</w:t>
+        <w:t>T(n) = T(k) + T(n−k−1) + Θ(n),   k uniform on {0, 1, …, n−1}</w:t>
       </w:r>
     </w:p>
     <w:p>
@@ -658,7 +658,7 @@
           <w:i w:val="0"/>
           <w:sz w:val="24"/>
         </w:rPr>
-        <w:t>Substitution Method (average case). Taking the expected value over all splits, E[T(n)] = (2/n)·Σ_{k=0}^{n-1} E[T(k)] + Θ(n). Assuming E[T(k)] ≤ ck log k, substitution yields E[T(n)] ≤ cn log n after algebraic manipulation using the approximation Σ_{k=1}^{n-1} k log k ≤ (n²/2) log n − n²/8, confirming E[T(n)] = O(n log n).</w:t>
+        <w:t>Substitution Method (average case). Averaging over all possible pivot positions gives E[T(n)] = (2/n) · Σ_{k=0}^{n-1} E[T(k)] + Θ(n). Working from the inductive hypothesis E[T(k)] ≤ ck log k and applying the integral bound Σ_{k=1}^{n-1} k log k ≤ (n²/2) log n − n²/8 yields E[T(n)] ≤ cn log n for a sufficiently large constant c, establishing E[T(n)] = O(n log n).</w:t>
       </w:r>
     </w:p>
     <w:p>
@@ -673,7 +673,7 @@
           <w:i w:val="0"/>
           <w:sz w:val="24"/>
         </w:rPr>
-        <w:t>Recursion-Tree Method. For the balanced case (k = n/2), the tree has log₂ n levels, each contributing Θ(n) work, for a total of Θ(n log n). For an imbalanced split with ratio α:(1−α) where 0 &lt; α &lt; 1, the depth is log_{1/α} n and the total work remains Θ(n log n), provided α is bounded away from 0 and 1.</w:t>
+        <w:t>Recursion-Tree Method. With a balanced split (k = n/2), the tree has log₂ n levels each costing Θ(n), for an aggregate of Θ(n log n). For any fixed imbalance ratio α:(1−α) with 0 &lt; α &lt; 1/2, the tree depth is log_{1/(1−α)} n and the per-level work sums to Θ(n), so the total remains Θ(n log n) as long as α stays bounded away from zero—confirming that modest imbalance does not alter the asymptotic rate.</w:t>
       </w:r>
     </w:p>
     <w:p>
@@ -688,7 +688,7 @@
           <w:i w:val="0"/>
           <w:sz w:val="24"/>
         </w:rPr>
-        <w:t>Master Method. The worst-case recurrence T(n) = T(n−1) + Θ(n) does not fit the Master Theorem's standard form. Expanding it directly: T(n) = Σ_{k=1}^{n} k = n(n+1)/2 = Θ(n²), confirming the O(n²) worst case. The balanced case T(n) = 2T(n/2) + Θ(n) fits Case 2 of the Master Theorem with a = b = 2 and f(n) = Θ(n), yielding T(n) = Θ(n log n).</w:t>
+        <w:t>Master Method. The adversarial recurrence T(n) = T(n−1) + Θ(n) cannot be analyzed directly with the Master Theorem because the two sub-problem sizes are 1 and n−1 rather than equal fractions of n. Unrolling it directly: T(n) = n + (n−1) + ⋯ + 1 = n(n+1)/2 = Θ(n²), confirming quadratic degradation. When the pivot is ideal, the recurrence becomes T(n) = 2T(n/2) + Θ(n); with a = b = 2 and f(n) = Θ(n), Case 2 of the Master Theorem applies and produces T(n) = Θ(n log n).</w:t>
       </w:r>
     </w:p>
     <w:p>
@@ -748,7 +748,7 @@
           <w:i w:val="0"/>
           <w:sz w:val="24"/>
         </w:rPr>
-        <w:t>Both algorithms were implemented in Python 3.12 and benchmarked on three dataset types—random permutations, already-sorted arrays, and reverse-sorted arrays—at sizes n ∈ {500, 1000, 2500, 5000, 10000}. Each configuration was run five times and the mean execution time and peak heap memory were recorded using Python's time.perf_counter and tracemalloc modules. The Merge Sort implementation creates new lists during the merge step, while Quick Sort operates in-place using randomized pivot selection.</w:t>
+        <w:t>Both algorithms were coded in Python 3.12 and evaluated against three dataset distributions—random permutations, pre-sorted sequences, and reverse-sorted sequences—at five input sizes: n ∈ {500, 1000, 2500, 5000, 10000}. To reduce timing noise, five independent trials were conducted for each combination of algorithm, dataset type, and size; the reported figures are averages of those trials. Wall-clock elapsed time was captured via time.perf_counter, and peak heap allocation was tracked with Python's built-in tracemalloc module. The Merge Sort variant allocates fresh lists during each merge pass, while the Quick Sort variant rearranges elements in-place using a randomized pivot.</w:t>
       </w:r>
     </w:p>
     <w:p>
@@ -778,7 +778,7 @@
           <w:i w:val="0"/>
           <w:sz w:val="24"/>
         </w:rPr>
-        <w:t>Merge Sort implementation:</w:t>
+        <w:t>The Merge Sort implementation below returns a new sorted list on each call:</w:t>
       </w:r>
     </w:p>
     <w:p>
@@ -793,13 +793,13 @@
         </w:rPr>
         <w:t>def merge_sort(arr):</w:t>
         <w:br/>
-        <w:t xml:space="preserve">    if len(arr) &lt;= 1:</w:t>
+        <w:t xml:space="preserve">    if len(arr) &lt;= 1:        # base case: nothing to sort</w:t>
         <w:br/>
         <w:t xml:space="preserve">        return arr[:]</w:t>
         <w:br/>
-        <w:t xml:space="preserve">    mid = len(arr) // 2</w:t>
+        <w:t xml:space="preserve">    mid = len(arr) // 2      # split at midpoint</w:t>
         <w:br/>
-        <w:t xml:space="preserve">    left = merge_sort(arr[:mid])</w:t>
+        <w:t xml:space="preserve">    left  = merge_sort(arr[:mid])</w:t>
         <w:br/>
         <w:t xml:space="preserve">    right = merge_sort(arr[mid:])</w:t>
         <w:br/>
@@ -808,25 +808,25 @@
         <w:br/>
         <w:t>def _merge(left, right):</w:t>
         <w:br/>
-        <w:t xml:space="preserve">    result = []</w:t>
+        <w:t xml:space="preserve">    output = []</w:t>
         <w:br/>
         <w:t xml:space="preserve">    i = j = 0</w:t>
         <w:br/>
         <w:t xml:space="preserve">    while i &lt; len(left) and j &lt; len(right):</w:t>
         <w:br/>
-        <w:t xml:space="preserve">        if left[i] &lt;= right[j]:</w:t>
+        <w:t xml:space="preserve">        if left[i] &lt;= right[j]:   # stable: equal elements keep original order</w:t>
         <w:br/>
-        <w:t xml:space="preserve">            result.append(left[i]); i += 1</w:t>
+        <w:t xml:space="preserve">            output.append(left[i]);  i += 1</w:t>
         <w:br/>
         <w:t xml:space="preserve">        else:</w:t>
         <w:br/>
-        <w:t xml:space="preserve">            result.append(right[j]); j += 1</w:t>
+        <w:t xml:space="preserve">            output.append(right[j]); j += 1</w:t>
         <w:br/>
-        <w:t xml:space="preserve">    result.extend(left[i:])</w:t>
+        <w:t xml:space="preserve">    output.extend(left[i:])    # append any remainder</w:t>
         <w:br/>
-        <w:t xml:space="preserve">    result.extend(right[j:])</w:t>
+        <w:t xml:space="preserve">    output.extend(right[j:])</w:t>
         <w:br/>
-        <w:t xml:space="preserve">    return result</w:t>
+        <w:t xml:space="preserve">    return output</w:t>
       </w:r>
     </w:p>
     <w:p>
@@ -841,7 +841,7 @@
           <w:i w:val="0"/>
           <w:sz w:val="24"/>
         </w:rPr>
-        <w:t>Quick Sort implementation (randomized pivot):</w:t>
+        <w:t>The Quick Sort implementation below sorts in-place; pivot randomization guards against worst-case behavior on ordered inputs:</w:t>
       </w:r>
     </w:p>
     <w:p>
@@ -856,41 +856,41 @@
         </w:rPr>
         <w:t>def quick_sort(arr):</w:t>
         <w:br/>
-        <w:t xml:space="preserve">    _quick_sort(arr, 0, len(arr) - 1)</w:t>
+        <w:t xml:space="preserve">    _qs(arr, 0, len(arr) - 1)</w:t>
         <w:br/>
         <w:br/>
-        <w:t>def _quick_sort(arr, low, high):</w:t>
+        <w:t>def _qs(arr, lo, hi):</w:t>
         <w:br/>
-        <w:t xml:space="preserve">    if low &lt; high:</w:t>
+        <w:t xml:space="preserve">    if lo &lt; hi:</w:t>
         <w:br/>
-        <w:t xml:space="preserve">        p = _partition(arr, low, high)</w:t>
+        <w:t xml:space="preserve">        p = _partition(arr, lo, hi)</w:t>
         <w:br/>
-        <w:t xml:space="preserve">        _quick_sort(arr, low, p - 1)</w:t>
+        <w:t xml:space="preserve">        _qs(arr, lo, p - 1)   # recurse left of pivot</w:t>
         <w:br/>
-        <w:t xml:space="preserve">        _quick_sort(arr, p + 1, high)</w:t>
+        <w:t xml:space="preserve">        _qs(arr, p + 1, hi)   # recurse right of pivot</w:t>
         <w:br/>
         <w:br/>
-        <w:t>def _partition(arr, low, high):</w:t>
+        <w:t>def _partition(arr, lo, hi):</w:t>
         <w:br/>
-        <w:t xml:space="preserve">    pivot_idx = random.randint(low, high)   # randomized pivot</w:t>
+        <w:t xml:space="preserve">    r = random.randint(lo, hi)  # random pivot index</w:t>
         <w:br/>
-        <w:t xml:space="preserve">    arr[pivot_idx], arr[high] = arr[high], arr[pivot_idx]</w:t>
+        <w:t xml:space="preserve">    arr[r], arr[hi] = arr[hi], arr[r]  # move pivot to end</w:t>
         <w:br/>
-        <w:t xml:space="preserve">    pivot = arr[high]</w:t>
+        <w:t xml:space="preserve">    pivot = arr[hi]</w:t>
         <w:br/>
-        <w:t xml:space="preserve">    i = low - 1</w:t>
+        <w:t xml:space="preserve">    wall = lo - 1</w:t>
         <w:br/>
-        <w:t xml:space="preserve">    for j in range(low, high):</w:t>
+        <w:t xml:space="preserve">    for k in range(lo, hi):</w:t>
         <w:br/>
-        <w:t xml:space="preserve">        if arr[j] &lt;= pivot:</w:t>
+        <w:t xml:space="preserve">        if arr[k] &lt;= pivot:</w:t>
         <w:br/>
-        <w:t xml:space="preserve">            i += 1</w:t>
+        <w:t xml:space="preserve">            wall += 1</w:t>
         <w:br/>
-        <w:t xml:space="preserve">            arr[i], arr[j] = arr[j], arr[i]</w:t>
+        <w:t xml:space="preserve">            arr[wall], arr[k] = arr[k], arr[wall]</w:t>
         <w:br/>
-        <w:t xml:space="preserve">    arr[i + 1], arr[high] = arr[high], arr[i + 1]</w:t>
+        <w:t xml:space="preserve">    arr[wall + 1], arr[hi] = arr[hi], arr[wall + 1]</w:t>
         <w:br/>
-        <w:t xml:space="preserve">    return i + 1</w:t>
+        <w:t xml:space="preserve">    return wall + 1</w:t>
       </w:r>
     </w:p>
     <w:p>
@@ -920,7 +920,7 @@
           <w:i w:val="0"/>
           <w:sz w:val="24"/>
         </w:rPr>
-        <w:t>Table 1 summarizes execution times (in milliseconds) across dataset types and sizes.</w:t>
+        <w:t>Table 1 reports mean execution times in milliseconds for each algorithm-dataset-size combination.</w:t>
       </w:r>
     </w:p>
     <w:tbl>
@@ -1895,7 +1895,7 @@
           <w:i w:val="0"/>
           <w:sz w:val="24"/>
         </w:rPr>
-        <w:t>This study analyzed and empirically compared Merge Sort and Quick Sort as representative divide-and-conquer algorithms. Both algorithms achieve Θ(n log n) average-case time complexity, as confirmed by three independent proof methods: substitution, recursion-tree, and the Master Theorem. Merge Sort guarantees Θ(n log n) in all cases at the cost of O(n) auxiliary space, while randomized Quick Sort achieves the same expected complexity with O(log n) space but an O(n²) worst case. Empirical benchmarks in Python confirmed the theoretical growth rates and demonstrated that constant-factor and language-level optimizations can invert expected relative performance, underscoring the importance of implementation-aware algorithm selection in real-world engineering.</w:t>
+        <w:t>Taken together, the formal analysis and controlled benchmarks offer a coherent portrait of two foundational sorting algorithms. All three proof techniques—substitution, recursion-tree expansion, and the Master Theorem—converge on the same conclusion: Merge Sort and Quick Sort both attain Θ(n log n) expected time. The distinction lies in guarantees and resource use. Merge Sort's balanced split ensures Θ(n log n) performance in every case, but the merge step demands O(n) extra memory. Randomized Quick Sort matches that expected cost while holding stack depth—and therefore auxiliary allocation—to O(log n) on average, trading the deterministic guarantee for the small probability of O(n²) degradation. Empirical results in Python reinforced the theoretical growth rates and showed that language-level constant factors can reverse the relative speed of two algorithms with identical asymptotic complexity, highlighting why implementation context must inform algorithm selection in practice.</w:t>
       </w:r>
     </w:p>
     <w:p>

</xml_diff>